<commit_message>
Updated Names and documentation
</commit_message>
<xml_diff>
--- a/ReadMe.docx
+++ b/ReadMe.docx
@@ -11,20 +11,24 @@
     <w:tbl>
       <w:tblPr>
         <w:tblStyle w:val="TableGrid"/>
-        <w:tblW w:w="0" w:type="auto"/>
+        <w:tblW w:w="12030" w:type="dxa"/>
+        <w:tblInd w:w="-1306" w:type="dxa"/>
         <w:tblLook w:val="04A0" w:firstRow="1" w:lastRow="0" w:firstColumn="1" w:lastColumn="0" w:noHBand="0" w:noVBand="1"/>
       </w:tblPr>
       <w:tblGrid>
-        <w:gridCol w:w="1666"/>
-        <w:gridCol w:w="1438"/>
-        <w:gridCol w:w="2934"/>
-        <w:gridCol w:w="1725"/>
-        <w:gridCol w:w="1587"/>
+        <w:gridCol w:w="1923"/>
+        <w:gridCol w:w="1238"/>
+        <w:gridCol w:w="5072"/>
+        <w:gridCol w:w="1660"/>
+        <w:gridCol w:w="2137"/>
       </w:tblGrid>
       <w:tr>
-        <w:tc>
-          <w:tcPr>
-            <w:tcW w:w="2026" w:type="dxa"/>
+        <w:trPr>
+          <w:trHeight w:val="591"/>
+        </w:trPr>
+        <w:tc>
+          <w:tcPr>
+            <w:tcW w:w="1925" w:type="dxa"/>
           </w:tcPr>
           <w:p>
             <w:r>
@@ -34,7 +38,7 @@
         </w:tc>
         <w:tc>
           <w:tcPr>
-            <w:tcW w:w="1763" w:type="dxa"/>
+            <w:tcW w:w="1224" w:type="dxa"/>
           </w:tcPr>
           <w:p>
             <w:r>
@@ -44,17 +48,17 @@
         </w:tc>
         <w:tc>
           <w:tcPr>
-            <w:tcW w:w="1967" w:type="dxa"/>
-          </w:tcPr>
-          <w:p>
-            <w:r>
-              <w:t>Nickname</w:t>
-            </w:r>
-          </w:p>
-        </w:tc>
-        <w:tc>
-          <w:tcPr>
-            <w:tcW w:w="1995" w:type="dxa"/>
+            <w:tcW w:w="5082" w:type="dxa"/>
+          </w:tcPr>
+          <w:p>
+            <w:r>
+              <w:t>Description</w:t>
+            </w:r>
+          </w:p>
+        </w:tc>
+        <w:tc>
+          <w:tcPr>
+            <w:tcW w:w="1660" w:type="dxa"/>
           </w:tcPr>
           <w:p>
             <w:r>
@@ -64,7 +68,7 @@
         </w:tc>
         <w:tc>
           <w:tcPr>
-            <w:tcW w:w="1599" w:type="dxa"/>
+            <w:tcW w:w="2139" w:type="dxa"/>
           </w:tcPr>
           <w:p>
             <w:r>
@@ -74,9 +78,12 @@
         </w:tc>
       </w:tr>
       <w:tr>
-        <w:tc>
-          <w:tcPr>
-            <w:tcW w:w="2026" w:type="dxa"/>
+        <w:trPr>
+          <w:trHeight w:val="2676"/>
+        </w:trPr>
+        <w:tc>
+          <w:tcPr>
+            <w:tcW w:w="1925" w:type="dxa"/>
           </w:tcPr>
           <w:p>
             <w:proofErr w:type="spellStart"/>
@@ -91,35 +98,46 @@
         </w:tc>
         <w:tc>
           <w:tcPr>
-            <w:tcW w:w="1763" w:type="dxa"/>
-          </w:tcPr>
-          <w:p>
-            <w:r>
-              <w:t xml:space="preserve">Python </w:t>
-            </w:r>
-            <w:r>
-              <w:t>Project</w:t>
-            </w:r>
-          </w:p>
-        </w:tc>
-        <w:tc>
-          <w:tcPr>
-            <w:tcW w:w="1967" w:type="dxa"/>
-          </w:tcPr>
-          <w:p>
+            <w:tcW w:w="1224" w:type="dxa"/>
+          </w:tcPr>
+          <w:p>
+            <w:r>
+              <w:t>Python Project</w:t>
+            </w:r>
+          </w:p>
+        </w:tc>
+        <w:tc>
+          <w:tcPr>
+            <w:tcW w:w="5082" w:type="dxa"/>
+          </w:tcPr>
+          <w:p>
+            <w:r>
+              <w:t xml:space="preserve">Pet Project from </w:t>
+            </w:r>
             <w:proofErr w:type="spellStart"/>
             <w:r>
-              <w:t>Remoteless</w:t>
+              <w:t>Paternatiy</w:t>
             </w:r>
             <w:proofErr w:type="spellEnd"/>
             <w:r>
-              <w:t xml:space="preserve"> Control</w:t>
-            </w:r>
-          </w:p>
-        </w:tc>
-        <w:tc>
-          <w:tcPr>
-            <w:tcW w:w="1995" w:type="dxa"/>
+              <w:t xml:space="preserve">: Leveraging </w:t>
+            </w:r>
+            <w:proofErr w:type="spellStart"/>
+            <w:r>
+              <w:t>MediaPipe</w:t>
+            </w:r>
+            <w:proofErr w:type="spellEnd"/>
+            <w:r>
+              <w:t xml:space="preserve">, we use the camera to track hand gestures: Are you pointing and </w:t>
+            </w:r>
+            <w:r>
+              <w:t xml:space="preserve">gesturing up/down/left/right.   It’s far from professional grade, but it was a fun project to keep the lights on in my head leveraging a more agentic approach to AI.  </w:t>
+            </w:r>
+          </w:p>
+        </w:tc>
+        <w:tc>
+          <w:tcPr>
+            <w:tcW w:w="1660" w:type="dxa"/>
           </w:tcPr>
           <w:p>
             <w:r>
@@ -129,7 +147,7 @@
         </w:tc>
         <w:tc>
           <w:tcPr>
-            <w:tcW w:w="1599" w:type="dxa"/>
+            <w:tcW w:w="2139" w:type="dxa"/>
           </w:tcPr>
           <w:p>
             <w:r>
@@ -139,19 +157,22 @@
         </w:tc>
       </w:tr>
       <w:tr>
-        <w:tc>
-          <w:tcPr>
-            <w:tcW w:w="2026" w:type="dxa"/>
-          </w:tcPr>
-          <w:p>
-            <w:r>
-              <w:t>Capstone Final</w:t>
-            </w:r>
-          </w:p>
-        </w:tc>
-        <w:tc>
-          <w:tcPr>
-            <w:tcW w:w="1763" w:type="dxa"/>
+        <w:trPr>
+          <w:trHeight w:val="2390"/>
+        </w:trPr>
+        <w:tc>
+          <w:tcPr>
+            <w:tcW w:w="1925" w:type="dxa"/>
+          </w:tcPr>
+          <w:p>
+            <w:r>
+              <w:t>Stock Market Predictor (NLP)</w:t>
+            </w:r>
+          </w:p>
+        </w:tc>
+        <w:tc>
+          <w:tcPr>
+            <w:tcW w:w="1224" w:type="dxa"/>
           </w:tcPr>
           <w:p>
             <w:r>
@@ -161,44 +182,54 @@
         </w:tc>
         <w:tc>
           <w:tcPr>
-            <w:tcW w:w="1967" w:type="dxa"/>
-          </w:tcPr>
-          <w:p>
-            <w:r>
-              <w:t>Stock Market Predictor (NLP)</w:t>
-            </w:r>
-          </w:p>
-        </w:tc>
-        <w:tc>
-          <w:tcPr>
-            <w:tcW w:w="1995" w:type="dxa"/>
-          </w:tcPr>
-          <w:p>
-            <w:r>
-              <w:t>Depreciated: Yahoo</w:t>
-            </w:r>
-            <w:r>
-              <w:t xml:space="preserve"> Finance API is </w:t>
+            <w:tcW w:w="5082" w:type="dxa"/>
+          </w:tcPr>
+          <w:p>
+            <w:r>
+              <w:t xml:space="preserve">Graduate Capstone Project: This will scrape articles </w:t>
+            </w:r>
+            <w:r>
+              <w:t xml:space="preserve">and candlestick data for any stock symbol.  Leveraging NLP/ML processes, we come up with a buy/sell signal in a </w:t>
             </w:r>
             <w:proofErr w:type="gramStart"/>
             <w:r>
+              <w:t>2 day</w:t>
+            </w:r>
+            <w:proofErr w:type="gramEnd"/>
+            <w:r>
+              <w:t xml:space="preserve"> window.  </w:t>
+            </w:r>
+            <w:proofErr w:type="spellStart"/>
+            <w:r>
+              <w:t>Unforunatelly</w:t>
+            </w:r>
+            <w:proofErr w:type="spellEnd"/>
+            <w:r>
+              <w:t xml:space="preserve">, this is not a money printing machine… yet. </w:t>
+            </w:r>
+          </w:p>
+        </w:tc>
+        <w:tc>
+          <w:tcPr>
+            <w:tcW w:w="1660" w:type="dxa"/>
+          </w:tcPr>
+          <w:p>
+            <w:r>
+              <w:t xml:space="preserve">Depreciated: Yahoo Finance API is </w:t>
+            </w:r>
+            <w:proofErr w:type="gramStart"/>
+            <w:r>
               <w:t>depreciated</w:t>
             </w:r>
             <w:proofErr w:type="gramEnd"/>
             <w:r>
-              <w:t xml:space="preserve"> and </w:t>
-            </w:r>
-            <w:r>
-              <w:t xml:space="preserve">migration would require a premium service.  </w:t>
-            </w:r>
-            <w:r>
-              <w:t xml:space="preserve"> </w:t>
-            </w:r>
-          </w:p>
-        </w:tc>
-        <w:tc>
-          <w:tcPr>
-            <w:tcW w:w="1599" w:type="dxa"/>
+              <w:t xml:space="preserve"> and migration would require a premium service.   </w:t>
+            </w:r>
+          </w:p>
+        </w:tc>
+        <w:tc>
+          <w:tcPr>
+            <w:tcW w:w="2139" w:type="dxa"/>
           </w:tcPr>
           <w:p>
             <w:r>
@@ -208,19 +239,22 @@
         </w:tc>
       </w:tr>
       <w:tr>
-        <w:tc>
-          <w:tcPr>
-            <w:tcW w:w="2026" w:type="dxa"/>
-          </w:tcPr>
-          <w:p>
-            <w:r>
-              <w:t>ML Final</w:t>
-            </w:r>
-          </w:p>
-        </w:tc>
-        <w:tc>
-          <w:tcPr>
-            <w:tcW w:w="1763" w:type="dxa"/>
+        <w:trPr>
+          <w:trHeight w:val="2390"/>
+        </w:trPr>
+        <w:tc>
+          <w:tcPr>
+            <w:tcW w:w="1925" w:type="dxa"/>
+          </w:tcPr>
+          <w:p>
+            <w:r>
+              <w:t>Stock Market Predictor (LSTM)</w:t>
+            </w:r>
+          </w:p>
+        </w:tc>
+        <w:tc>
+          <w:tcPr>
+            <w:tcW w:w="1224" w:type="dxa"/>
           </w:tcPr>
           <w:p>
             <w:r>
@@ -230,17 +264,17 @@
         </w:tc>
         <w:tc>
           <w:tcPr>
-            <w:tcW w:w="1967" w:type="dxa"/>
-          </w:tcPr>
-          <w:p>
-            <w:r>
-              <w:t>Stock Market Predictor (LSTM)</w:t>
-            </w:r>
-          </w:p>
-        </w:tc>
-        <w:tc>
-          <w:tcPr>
-            <w:tcW w:w="1995" w:type="dxa"/>
+            <w:tcW w:w="5082" w:type="dxa"/>
+          </w:tcPr>
+          <w:p>
+            <w:r>
+              <w:t xml:space="preserve">Graduate Final Project:  This only scrapes candle stick data and trains prior day stock prices to see a buy/sell signal for the upcoming days using an LTSM.  </w:t>
+            </w:r>
+          </w:p>
+        </w:tc>
+        <w:tc>
+          <w:tcPr>
+            <w:tcW w:w="1660" w:type="dxa"/>
           </w:tcPr>
           <w:p>
             <w:r>
@@ -258,7 +292,7 @@
         </w:tc>
         <w:tc>
           <w:tcPr>
-            <w:tcW w:w="1599" w:type="dxa"/>
+            <w:tcW w:w="2139" w:type="dxa"/>
           </w:tcPr>
           <w:p>
             <w:r>
@@ -268,19 +302,30 @@
         </w:tc>
       </w:tr>
       <w:tr>
-        <w:tc>
-          <w:tcPr>
-            <w:tcW w:w="2026" w:type="dxa"/>
-          </w:tcPr>
-          <w:p>
-            <w:r>
-              <w:t xml:space="preserve">NLP Project Final </w:t>
-            </w:r>
-          </w:p>
-        </w:tc>
-        <w:tc>
-          <w:tcPr>
-            <w:tcW w:w="1763" w:type="dxa"/>
+        <w:trPr>
+          <w:trHeight w:val="1164"/>
+        </w:trPr>
+        <w:tc>
+          <w:tcPr>
+            <w:tcW w:w="1925" w:type="dxa"/>
+          </w:tcPr>
+          <w:p>
+            <w:proofErr w:type="spellStart"/>
+            <w:r>
+              <w:t>Heapq</w:t>
+            </w:r>
+            <w:proofErr w:type="spellEnd"/>
+            <w:r>
+              <w:t xml:space="preserve"> </w:t>
+            </w:r>
+            <w:r>
+              <w:t>generation</w:t>
+            </w:r>
+          </w:p>
+        </w:tc>
+        <w:tc>
+          <w:tcPr>
+            <w:tcW w:w="1224" w:type="dxa"/>
           </w:tcPr>
           <w:p>
             <w:r>
@@ -290,22 +335,25 @@
         </w:tc>
         <w:tc>
           <w:tcPr>
-            <w:tcW w:w="1967" w:type="dxa"/>
-          </w:tcPr>
-          <w:p>
+            <w:tcW w:w="5082" w:type="dxa"/>
+          </w:tcPr>
+          <w:p>
+            <w:r>
+              <w:t xml:space="preserve">This reads books (a book about NLP by default) and uses </w:t>
+            </w:r>
             <w:proofErr w:type="spellStart"/>
             <w:r>
               <w:t>Heapq</w:t>
             </w:r>
             <w:proofErr w:type="spellEnd"/>
             <w:r>
-              <w:t xml:space="preserve"> book summarization/generation</w:t>
-            </w:r>
-          </w:p>
-        </w:tc>
-        <w:tc>
-          <w:tcPr>
-            <w:tcW w:w="1995" w:type="dxa"/>
+              <w:t xml:space="preserve"> to summarize the information.  ChatGPT before ChatGPT using conventional NLP methods and not pre-trained transformers.  </w:t>
+            </w:r>
+          </w:p>
+        </w:tc>
+        <w:tc>
+          <w:tcPr>
+            <w:tcW w:w="1660" w:type="dxa"/>
           </w:tcPr>
           <w:p>
             <w:r>
@@ -323,7 +371,7 @@
         </w:tc>
         <w:tc>
           <w:tcPr>
-            <w:tcW w:w="1599" w:type="dxa"/>
+            <w:tcW w:w="2139" w:type="dxa"/>
           </w:tcPr>
           <w:p>
             <w:r>
@@ -341,22 +389,17 @@
     </w:p>
     <w:p>
       <w:r>
-        <w:t xml:space="preserve">Rename Files to the nickname so you can drop the column, and it will just make sense to anyone who doesn’t read the documentation.  </w:t>
-      </w:r>
-    </w:p>
-    <w:p>
-      <w:r>
         <w:t>Add More Projects</w:t>
       </w:r>
     </w:p>
     <w:p>
       <w:r>
-        <w:lastRenderedPageBreak/>
         <w:t>Word up the documentation</w:t>
       </w:r>
     </w:p>
     <w:p>
       <w:r>
+        <w:lastRenderedPageBreak/>
         <w:t xml:space="preserve">Make </w:t>
       </w:r>
       <w:proofErr w:type="spellStart"/>
@@ -371,6 +414,19 @@
     <w:p>
       <w:r>
         <w:t xml:space="preserve">Make NLP Final Project a production ready document.  </w:t>
+      </w:r>
+    </w:p>
+    <w:p>
+      <w:r>
+        <w:t xml:space="preserve">Create </w:t>
+      </w:r>
+      <w:proofErr w:type="spellStart"/>
+      <w:r>
+        <w:t>consistant</w:t>
+      </w:r>
+      <w:proofErr w:type="spellEnd"/>
+      <w:r>
+        <w:t xml:space="preserve"> Operation guidelines so we don’t need instructions. </w:t>
       </w:r>
     </w:p>
     <w:p/>

</xml_diff>